<commit_message>
feat(practice): Tự luyện in exam-style parts, always shown; shuffle answer options; import templates explain practice
Practice questions group into Phần I trắc nghiệm / II đúng sai / III trả lời ngắn (/ IV viết). The Tự luyện tab shows on every lesson (empty state when no questions). Multiple-choice options are shuffled per visit in practice, exams and games (grading goes by option id). Word/Excel templates describe the [QUIZ:key] practice flow.

Co-Authored-By: Claude Sonnet 5.5 <noreply@anthropic.com>
</commit_message>
<xml_diff>
--- a/frontend/public/templates/scipal-lesson-import-template.docx
+++ b/frontend/public/templates/scipal-lesson-import-template.docx
@@ -19,7 +19,17 @@
     </w:p>
     <w:p>
       <w:r>
-        <w:t xml:space="preserve"># [QUIZ:mã-câu] lấy câu hỏi có question_key đó trong tệp Excel nhập cùng lúc (cùng môn).</w:t>
+        <w:t xml:space="preserve"># [QUIZ:mã-câu] lấy câu hỏi có question_key đó trong tệp Excel nhập cùng lúc (cùng môn) làm câu Tự luyện của bài.</w:t>
+      </w:r>
+    </w:p>
+    <w:p>
+      <w:r>
+        <w:t xml:space="preserve"># Tự luyện hiển thị theo 3 phần như đề kiểm tra: I trắc nghiệm, II đúng/sai, III trả lời ngắn (tự xếp theo loại câu, thứ tự đáp án được xáo).</w:t>
+      </w:r>
+    </w:p>
+    <w:p>
+      <w:r>
+        <w:t xml:space="preserve"># Mỗi mã câu chỉ dùng cho một bài, và câu đã dùng ở đây sẽ không vào đề thi.</w:t>
       </w:r>
     </w:p>
     <w:p>
@@ -195,6 +205,16 @@
     <w:p>
       <w:r>
         <w:t xml:space="preserve">[QUIZ:vd-nhi-phan]</w:t>
+      </w:r>
+    </w:p>
+    <w:p>
+      <w:r>
+        <w:t xml:space="preserve">[QUIZ:vd-dung-sai]</w:t>
+      </w:r>
+    </w:p>
+    <w:p>
+      <w:r>
+        <w:t xml:space="preserve">[QUIZ:vd-tra-loi-ngan]</w:t>
       </w:r>
     </w:p>
     <w:sectPr>

</xml_diff>

<commit_message>
feat(import): Word import template covers English writing practice
The template still described three practice parts and quizzed three
questions. Describe the IV writing part and add [QUIZ:vd-viet-anh], the
writing example of the Excel template.

Co-Authored-By: Claude Sonnet 5.5 <noreply@anthropic.com>
</commit_message>
<xml_diff>
--- a/frontend/public/templates/scipal-lesson-import-template.docx
+++ b/frontend/public/templates/scipal-lesson-import-template.docx
@@ -24,7 +24,12 @@
     </w:p>
     <w:p>
       <w:r>
-        <w:t xml:space="preserve"># Tự luyện hiển thị theo 3 phần như đề kiểm tra: I trắc nghiệm, II đúng/sai, III trả lời ngắn (tự xếp theo loại câu, thứ tự đáp án được xáo).</w:t>
+        <w:t xml:space="preserve"># Tự luyện hiển thị theo các phần như đề kiểm tra: I trắc nghiệm, II đúng/sai, III trả lời ngắn, IV viết tiếng Anh (tự xếp theo loại câu, thứ tự đáp án được xáo).</w:t>
+      </w:r>
+    </w:p>
+    <w:p>
+      <w:r>
+        <w:t xml:space="preserve"># Câu viết tiếng Anh (type writing) chỉ dùng cho Tự luyện: khai báo ở tệp Excel (câu mẫu ở answer_key, cụm bắt buộc ở key_terms) rồi gọi bằng [QUIZ:mã-câu] như các câu khác.</w:t>
       </w:r>
     </w:p>
     <w:p>
@@ -215,6 +220,11 @@
     <w:p>
       <w:r>
         <w:t xml:space="preserve">[QUIZ:vd-tra-loi-ngan]</w:t>
+      </w:r>
+    </w:p>
+    <w:p>
+      <w:r>
+        <w:t xml:space="preserve">[QUIZ:vd-viet-anh]</w:t>
       </w:r>
     </w:p>
     <w:sectPr>

</xml_diff>